<commit_message>
Update ForcedAlignment deep-dive report
</commit_message>
<xml_diff>
--- a/ForcedAlignment/Gloss_Labeling_Report_Filled.docx
+++ b/ForcedAlignment/Gloss_Labeling_Report_Filled.docx
@@ -1398,7 +1398,7 @@
                 <w:b w:val="0"/>
                 <w:sz w:val="20"/>
               </w:rPr>
-              <w:t>CC_Aligned2 ไม่มีอยู่จริงใน dataset; ใช้ CC_Aligned พร้อมเพิ่ม sil หัว/ท้าย. Fallback 427 rows = 57 clips ที่ embedding หาย × tokens ต่อ clip (CC tokens + sil หัว/ท้าย)</w:t>
+              <w:t>CC_Aligned2 ไม่มีอยู่จริงใน dataset; ใช้ CC_Aligned พร้อมเพิ่ม sil หัว/ท้าย. ผลตกหนัก (F1 17.6% vs config 1 ที่ 68.6%) เพราะ architectural mismatch: SEA E4s-1 segmenter ตัด segment เฉพาะตอน active signing (ไม่สร้าง segment สำหรับ sil) → เมื่อเพิ่ม sil tokens ใน input, จำนวน tokens เกินจำนวน segments (K &lt; T) ใน 85 clips → fallback uniform. รวม fallback clips จริง = 142 (57 จาก embedding หาย + 85 จาก K &lt; T)</w:t>
             </w:r>
             <w:r>
               <w:rPr>
@@ -2199,7 +2199,7 @@
                 <w:b w:val="0"/>
                 <w:sz w:val="20"/>
               </w:rPr>
-              <w:t>รวม sil token ใน input และ GT. Fallback 495 rows = 57 clips × (avg ~3.5 tokens/clip รวม sil)</w:t>
+              <w:t>รวม sil token ใน input และ GT. Fallback clips จริง = 154 (57 จาก K=0 + 97 จาก K&lt;T). F1 (20.7%) ดูดีกว่า config 3 (7.8%) แต่ DP จริง ๆ ทำได้แย่กว่า — split per-pair: DP-driven pairs mean IoU = 0.154 (hit 11.1%), fallback uniform pairs mean IoU = 0.709 (hit 88.3%). 53% ของ hits ทั้งหมดมาจาก fallback uniform ที่บังเอิญตรง GT structure (sil+word+sil ใน GT ก็แบ่ง clip เท่า ๆ กันเหมือน uniform split)</w:t>
             </w:r>
             <w:r>
               <w:rPr>
@@ -2599,7 +2599,7 @@
                 <w:b w:val="0"/>
                 <w:sz w:val="20"/>
               </w:rPr>
-              <w:t>รวม sil1/sil2 token ใน input และ GT. ผลใกล้เคียง config 4 (เพราะ token count เท่ากัน เพียงแต่ sil ถูก numbered)</w:t>
+              <w:t>รวม sil1/sil2 token ใน input และ GT. ผลเกือบเท่า config 4 (F1 20.9% vs 20.7%) — 91.7% ของ predictions identical กับ config 4. Numbered sil ไม่ช่วย DP เลือก segment ต่างกันมีนัยสำคัญ เพราะ SEA ไม่มี sil segments อยู่แล้ว. Fallback clips = 154 เท่ากับ config 4</w:t>
             </w:r>
             <w:r>
               <w:rPr>
@@ -5234,7 +5234,7 @@
                 <w:b w:val="0"/>
                 <w:sz w:val="20"/>
               </w:rPr>
-              <w:t>1. Config #1 ชนะทุก metric หลักใน dataset นี้</w:t>
+              <w:t>1. Config #1 ชนะทุก metric หลักใน dataset นี้ — DP ทำงานได้ดี (DP-driven mean IoU 0.608, hit 73.5%)</w:t>
             </w:r>
             <w:r>
               <w:rPr>
@@ -5247,7 +5247,7 @@
                 <w:b w:val="0"/>
                 <w:sz w:val="20"/>
               </w:rPr>
-              <w:t>2. Config #3 (Gloss -&gt; Gloss_Labeling) ดู Mean IoU ต่ำ (0.2484) แต่ไม่ใช่ aligner ผิด — ผลจาก error analysis พบว่า text match 100%, 72.7% ของ predictions อยู่ภายใน GT, และ 88.7% ของความยาว pred อยู่ใน GT. สาเหตุคือ Gloss_Labeling annotation ยืดทุก word ให้กินช่วงเวลายาว (avg 3.84s) ขณะที่ aligner ทำนายช่วงสัญลักษณ์จริง (avg 1.16s) — IoU จึงต่ำตามนิยาม</w:t>
+              <w:t>2. ทุก config ที่มี sil ใน input (#2, #4, #5) มี K&lt;T fallback: Distinct fallback clips: #1=57, #2=142 (+85), #3=60, #4=154 (+97), #5=154 (+97). K=0 ใน 57 clips (SEA ไม่ detect sign เลย), K=1 ใน 40 clips, K=2 ใน 45 clips → Config 2 (T=3) ตกหล่น 142 clips จาก K&lt;3</w:t>
             </w:r>
             <w:r>
               <w:rPr>
@@ -5260,7 +5260,7 @@
                 <w:b w:val="0"/>
                 <w:sz w:val="20"/>
               </w:rPr>
-              <w:t>3. Config #4-5 (รวม sil ใน GT) ดีกว่า #3 เพราะ sil token แบ่ง GT ออกเป็นช่วงย่อย ทำให้ความกว้าง GT ใกล้ pred มากขึ้น (mIoU 0.22 vs 0.25 — Recall ดีขึ้น 2.6x)</w:t>
+              <w:t>3. ที่สำคัญกว่า: DP-driven pairs ทำได้แย่ในทุก sil-config — Config 2 DP mean IoU = 0.127 (hit 7%), Config 4 DP mean IoU = 0.154 (hit 11.1%) เทียบกับ Config 1 DP = 0.608 (hit 73.5%). sil tokens ทำให้ DP สับสน (per-token softmax บังคับให้จับ segment แม้ไม่มี match จริง)</w:t>
             </w:r>
             <w:r>
               <w:rPr>
@@ -5273,7 +5273,20 @@
                 <w:b w:val="0"/>
                 <w:sz w:val="20"/>
               </w:rPr>
-              <w:t>4. มี 57 clips ที่ SEA E4s-1 ไม่ตรวจพบ SIGN segments → ถูก uniform fallback. ใน config 2/4/5 fallback rows = 57 × tokens-per-clip จึงดูเยอะกว่า config 1</w:t>
+              <w:t>4. F1 ของ Config #2/#4/#5 ที่ดูสูงกว่า 'DP-only baseline' จริง ๆ มาจาก fallback uniform ที่บังเอิญตรงโครงสร้าง GT — Config 4 fallback hit 88.3%, Config 2 fallback hit 92.5% (uniform split ทำให้ pred = GT structure เพราะ ทั้งคู่แบ่ง clip เท่า ๆ กันด้วย sil tokens)</w:t>
+            </w:r>
+            <w:r>
+              <w:rPr>
+                <w:sz w:val="20"/>
+              </w:rPr>
+              <w:br/>
+            </w:r>
+            <w:r>
+              <w:rPr>
+                <w:b w:val="0"/>
+                <w:sz w:val="20"/>
+              </w:rPr>
+              <w:t>5. Config #3 (Gloss, no sil) Mean IoU 0.2484 ดูต่ำกว่า 04.mp4 baseline (0.4901) แต่ไม่ใช่ aligner regression — text match 100%, 72.7% ของ predictions อยู่ใน GT span, 88.7% ของความยาว pred อยู่ใน GT. สาเหตุคือ Gloss_Labeling ยืดทุก word ให้ครอบคลุม ช่วงเวลายาว (avg 3.84s) ขณะที่ aligner ทำนายช่วงสัญลักษณ์จริง (avg 1.16s)</w:t>
             </w:r>
           </w:p>
         </w:tc>
@@ -5352,7 +5365,7 @@
                 <w:b w:val="0"/>
                 <w:sz w:val="20"/>
               </w:rPr>
-              <w:t>1. ใช้ Config #1 เป็นผลหลักของรายงาน (F1 68.6%, mIoU 0.5928) — เทียบได้กับ 04.mp4 baseline</w:t>
+              <w:t>1. ใช้ Config #1 เป็นผลหลักของรายงาน (F1 68.6%, mIoU 0.5928) — เทียบได้กับ 04.mp4 baseline (0.4901) → ดีกว่า. DP-driven hit rate 73.5% สื่อว่า aligner แม่นยำจริงเมื่อ input ไม่มี sil tokens รบกวน</w:t>
             </w:r>
             <w:r>
               <w:rPr>
@@ -5365,7 +5378,7 @@
                 <w:b w:val="0"/>
                 <w:sz w:val="20"/>
               </w:rPr>
-              <w:t>2. ระมัดระวังเมื่อเทียบ Config #3 mIoU 0.2484 กับ 04.mp4 0.4901 โดยตรง — ตัวเลขต่ำเพราะ Gloss_Labeling ของ 2 dataset annotate ด้วย convention ต่างกัน (ForcedAlignment ยืด GT ให้เต็ม clip, 04.mp4 ใช้ช่วงสัญลักษณ์จริง) ไม่ใช่ aligner regression</w:t>
+              <w:t>2. อย่ารายงาน Config #2/#4/#5 เป็น 'sil modeling แย่' — bottleneck คือ DP ที่สับสน เมื่อมี sil tokens ใน input ไม่ใช่เพราะ sil concept เอง. ทางแก้:</w:t>
             </w:r>
             <w:r>
               <w:rPr>
@@ -5378,7 +5391,7 @@
                 <w:b w:val="0"/>
                 <w:sz w:val="20"/>
               </w:rPr>
-              <w:t>3. ถ้าต้องการ metric เทียบ Gloss config โดยตรง แนะนำใช้ Frame Accuracy (26.2% สำหรับ #3) หรือ % any-overlap (97.3%) แทน IoU@0.5</w:t>
+              <w:t xml:space="preserve">   (A) Post-processing: ใช้ Config #1 หรือ #3 ทำ word alignment ก่อน แล้วเติม sil intervals ระหว่าง word predictions ในขั้นตอนแยก (ไม่ผ่าน DP เลย)</w:t>
             </w:r>
             <w:r>
               <w:rPr>
@@ -5391,7 +5404,59 @@
                 <w:b w:val="0"/>
                 <w:sz w:val="20"/>
               </w:rPr>
-              <w:t>4. ปรับ SEA segmentation threshold หรือใช้ pose-based fallback เพื่อลด 57 clips ที่ตกเป็น uniform fallback ในรอบถัดไป</w:t>
+              <w:t xml:space="preserve">   (B) แก้ DP cost: ให้ sil tokens skip embedding หรือใช้ uniform similarity เพื่อไม่บังคับ DP เลือก word-segment ผิด</w:t>
+            </w:r>
+            <w:r>
+              <w:rPr>
+                <w:sz w:val="20"/>
+              </w:rPr>
+              <w:br/>
+            </w:r>
+            <w:r>
+              <w:rPr>
+                <w:b w:val="0"/>
+                <w:sz w:val="20"/>
+              </w:rPr>
+              <w:t xml:space="preserve">   (C) Fine-tune SEA E4s-1 ให้ output multi-class (sign/sil/transition)</w:t>
+            </w:r>
+            <w:r>
+              <w:rPr>
+                <w:sz w:val="20"/>
+              </w:rPr>
+              <w:br/>
+            </w:r>
+            <w:r>
+              <w:rPr>
+                <w:b w:val="0"/>
+                <w:sz w:val="20"/>
+              </w:rPr>
+              <w:t>3. ระมัดระวังเมื่อเทียบ Config #3 mIoU 0.2484 กับ 04.mp4 0.4901 โดยตรง — ตัวเลขต่ำเพราะ annotation convention ต่างกัน (ForcedAlignment ยืด GT ให้เต็ม clip, 04.mp4 ใช้ช่วงสัญลักษณ์จริง) ไม่ใช่ aligner regression</w:t>
+            </w:r>
+            <w:r>
+              <w:rPr>
+                <w:sz w:val="20"/>
+              </w:rPr>
+              <w:br/>
+            </w:r>
+            <w:r>
+              <w:rPr>
+                <w:b w:val="0"/>
+                <w:sz w:val="20"/>
+              </w:rPr>
+              <w:t>4. สำหรับ Gloss config แนะนำ Frame Accuracy (26.2%) หรือ % any-overlap (97.3%) แทน IoU@0.5 เพราะไม่อ่อนไหวต่อความกว้างของ GT</w:t>
+            </w:r>
+            <w:r>
+              <w:rPr>
+                <w:sz w:val="20"/>
+              </w:rPr>
+              <w:br/>
+            </w:r>
+            <w:r>
+              <w:rPr>
+                <w:b w:val="0"/>
+                <w:sz w:val="20"/>
+              </w:rPr>
+              <w:t>5. 57 clips ที่ SEA detect K=0 segments เป็น hard limit ของ E4s-1 — ปรับ threshold sign-b=30/sign-o=50 หรือใช้ pose-based heuristic fallback (เช่น hand motion peaks) แทน uniform split</w:t>
             </w:r>
           </w:p>
         </w:tc>

</xml_diff>